<commit_message>
feat: add xlsx dependency and document files
- Add `xlsx` to dependencies to support Excel file processing.
- Include initial inspection data and updated document templates.
</commit_message>
<xml_diff>
--- a/public/downloads/KE_HOACH_KIEM_TRA_NOI_BO_2026_2027_THCS_THPT_DOC_BINH_KIEU.docx
+++ b/public/downloads/KE_HOACH_KIEM_TRA_NOI_BO_2026_2027_THCS_THPT_DOC_BINH_KIEU.docx
@@ -1036,7 +1036,7 @@
                 <w:sz w:val="20"/>
                 <w:szCs w:val="20"/>
               </w:rPr>
-              <w:t xml:space="preserve">Trần Minh Hậu (PHT)</w:t>
+              <w:t xml:space="preserve">Nguyễn Thanh Tòng (PHT phụ trách Điểm Tân Kiều)</w:t>
             </w:r>
           </w:p>
         </w:tc>
@@ -1101,7 +1101,7 @@
                 <w:sz w:val="20"/>
                 <w:szCs w:val="20"/>
               </w:rPr>
-              <w:t xml:space="preserve">06 GV các tổ Toán-Tin, Văn, KHTN, Tiếng Anh</w:t>
+              <w:t xml:space="preserve">06 GV các tổ Toán, Văn, KHTN, Ngoại ngữ-Tin học</w:t>
             </w:r>
           </w:p>
         </w:tc>
@@ -1302,7 +1302,7 @@
                 <w:sz w:val="20"/>
                 <w:szCs w:val="20"/>
               </w:rPr>
-              <w:t xml:space="preserve">Trần Minh Hậu (PHT)</w:t>
+              <w:t xml:space="preserve">Phan Thanh Thảo (PHT phụ trách Điểm THCS Đốc Binh Kiều)</w:t>
             </w:r>
           </w:p>
         </w:tc>
@@ -1967,7 +1967,7 @@
                 <w:sz w:val="20"/>
                 <w:szCs w:val="20"/>
               </w:rPr>
-              <w:t xml:space="preserve">Trần Minh Hậu (PHT)</w:t>
+              <w:t xml:space="preserve">Phan Thanh Thảo (PHT phụ trách Điểm THCS Đốc Binh Kiều)</w:t>
             </w:r>
           </w:p>
         </w:tc>
@@ -2032,7 +2032,7 @@
                 <w:sz w:val="20"/>
                 <w:szCs w:val="20"/>
               </w:rPr>
-              <w:t xml:space="preserve">08 GV các tổ KHXH, GDTC, Toán-Tin, Văn (3 điểm trường)</w:t>
+              <w:t xml:space="preserve">08 GV các tổ KHXH, GDTC, Toán, Văn (3 điểm trường)</w:t>
             </w:r>
           </w:p>
         </w:tc>
@@ -2366,7 +2366,7 @@
                 <w:sz w:val="20"/>
                 <w:szCs w:val="20"/>
               </w:rPr>
-              <w:t xml:space="preserve">Trần Minh Hậu (PHT)</w:t>
+              <w:t xml:space="preserve">Phan Thanh Thảo (PHT) &amp; Nguyễn Thanh Tòng (PHT)</w:t>
             </w:r>
           </w:p>
         </w:tc>

</xml_diff>